<commit_message>
Restaurar el v2 revisado y emitir el v3 con las correcciones
El commit anterior sobrescribio el contenido del v2, que ya habia sido
sometido a revision. Se corrige ese criterio: cada correccion se emite
como una version nueva y las versiones anteriores permanecen intactas.

- Informe_TFG_Bastian_Darwit_v2.docx se restaura al contenido exacto que
  fue revisado, correspondiente al commit e7eddb7.
- Informe_TFG_Bastian_Darwit_v3.docx incorpora las correcciones derivadas
  de esa revision:
  - Los Anexos C, D y E se citan por letra en el cuerpo, en los apartados
    2.5 y 2.7, con lo que los cinco anexos quedan citados conforme al
    Articulo 5 del instructivo.
  - Los 13 campos de indice y de rotulacion se marcan con w:dirty para
    que Word los actualice al abrir el documento.
</commit_message>
<xml_diff>
--- a/Informe_TFG_Bastian_Darwit_v2.docx
+++ b/Informe_TFG_Bastian_Darwit_v2.docx
@@ -669,9 +669,9 @@
       <w:pPr>
         <w:pStyle w:val="TOC1"/>
       </w:pPr>
-      <w:fldSimple w:dirty="true" w:instr=" TOC \o &quot;1-3&quot; \h \z \u ">
+      <w:fldSimple w:instr=" TOC \o &quot;1-3&quot; \h \z \u ">
         <w:r>
-          <w:t xml:space="preserve">Word genera este índice automáticamente al abrir el documento; si no aparece, actualícelo con F9.</w:t>
+          <w:t xml:space="preserve">Actualizar este índice en Word con F9.</w:t>
         </w:r>
       </w:fldSimple>
     </w:p>
@@ -687,9 +687,9 @@
       <w:pPr>
         <w:pStyle w:val="TOC1"/>
       </w:pPr>
-      <w:fldSimple w:dirty="true" w:instr=" TOC \h \z \c &quot;Tabla&quot; ">
+      <w:fldSimple w:instr=" TOC \h \z \c &quot;Tabla&quot; ">
         <w:r>
-          <w:t xml:space="preserve">Word genera este índice automáticamente al abrir el documento; si no aparece, actualícelo con F9.</w:t>
+          <w:t xml:space="preserve">Actualizar este índice en Word con F9.</w:t>
         </w:r>
       </w:fldSimple>
     </w:p>
@@ -705,9 +705,9 @@
       <w:pPr>
         <w:pStyle w:val="TOC1"/>
       </w:pPr>
-      <w:fldSimple w:dirty="true" w:instr=" TOC \h \z \c &quot;Figura&quot; ">
+      <w:fldSimple w:instr=" TOC \h \z \c &quot;Figura&quot; ">
         <w:r>
-          <w:t xml:space="preserve">Word genera este índice automáticamente al abrir el documento; si no aparece, actualícelo con F9.</w:t>
+          <w:t xml:space="preserve">Actualizar este índice en Word con F9.</w:t>
         </w:r>
       </w:fldSimple>
     </w:p>
@@ -1985,7 +1985,7 @@
         </w:rPr>
         <w:t xml:space="preserve">Tabla </w:t>
       </w:r>
-      <w:fldSimple w:dirty="true" w:instr=" SEQ Tabla \* ARABIC ">
+      <w:fldSimple w:instr=" SEQ Tabla \* ARABIC ">
         <w:r>
           <w:t xml:space="preserve">1</w:t>
         </w:r>
@@ -2396,7 +2396,7 @@
         </w:rPr>
         <w:t xml:space="preserve">Figura </w:t>
       </w:r>
-      <w:fldSimple w:dirty="true" w:instr=" SEQ Figura \* ARABIC ">
+      <w:fldSimple w:instr=" SEQ Figura \* ARABIC ">
         <w:r>
           <w:t xml:space="preserve">1</w:t>
         </w:r>
@@ -2782,7 +2782,7 @@
         </w:rPr>
         <w:t xml:space="preserve">Tabla </w:t>
       </w:r>
-      <w:fldSimple w:dirty="true" w:instr=" SEQ Tabla \* ARABIC ">
+      <w:fldSimple w:instr=" SEQ Tabla \* ARABIC ">
         <w:r>
           <w:t xml:space="preserve">1</w:t>
         </w:r>
@@ -3277,16 +3277,11 @@
       </w:r>
     </w:p>
     <w:p>
-      <w:r>
-        <w:t xml:space="preserve">Las pautas que operacionalizan estas técnicas se adjuntan en el Anexo D. Los medios materiales, los accesos y los recursos metodológicos que sustentan su aplicación se detallan en el Anexo C.</w:t>
-      </w:r>
-    </w:p>
-    <w:p>
       <w:pPr>
         <w:pStyle w:val="Pendiente"/>
       </w:pPr>
       <w:r>
-        <w:t xml:space="preserve">[PENDIENTE] Completar el Anexo D con las pautas efectivamente utilizadas: pauta de registro documental, pauta de entrevista semiestructurada y pauta de taller de análisis de riesgo, junto con las escalas de probabilidad e impacto adoptadas.</w:t>
+        <w:t xml:space="preserve">[PENDIENTE] Adjuntar como anexos las pautas efectivamente utilizadas: pauta de registro documental, pauta de entrevista semiestructurada y pauta de taller de análisis de riesgo, junto con las escalas de probabilidad e impacto adoptadas.</w:t>
       </w:r>
     </w:p>
     <w:p>
@@ -3326,16 +3321,11 @@
       </w:r>
     </w:p>
     <w:p>
-      <w:r>
-        <w:t xml:space="preserve">La carta de compromiso mediante la cual la compañía respalda el acceso a la información y la participación de los dueños de proceso se adjunta en el Anexo E.</w:t>
-      </w:r>
-    </w:p>
-    <w:p>
       <w:pPr>
         <w:pStyle w:val="Pendiente"/>
       </w:pPr>
       <w:r>
-        <w:t xml:space="preserve">[PENDIENTE] Confirmar con Arauco y con el Profesor Guía el mecanismo formal de consentimiento o autorización de los participantes, e incorporar la carta de compromiso en el Anexo E.</w:t>
+        <w:t xml:space="preserve">[PENDIENTE] Confirmar con Arauco y con el Profesor Guía el mecanismo formal de consentimiento o autorización de los participantes, y adjuntar la carta de compromiso de la compañía como anexo.</w:t>
       </w:r>
     </w:p>
     <w:p>
@@ -3375,7 +3365,7 @@
         </w:rPr>
         <w:t xml:space="preserve">Tabla </w:t>
       </w:r>
-      <w:fldSimple w:dirty="true" w:instr=" SEQ Tabla \* ARABIC ">
+      <w:fldSimple w:instr=" SEQ Tabla \* ARABIC ">
         <w:r>
           <w:t xml:space="preserve">1</w:t>
         </w:r>
@@ -4884,7 +4874,7 @@
         </w:rPr>
         <w:t xml:space="preserve">Tabla </w:t>
       </w:r>
-      <w:fldSimple w:dirty="true" w:instr=" SEQ Tabla \* ARABIC ">
+      <w:fldSimple w:instr=" SEQ Tabla \* ARABIC ">
         <w:r>
           <w:t xml:space="preserve">1</w:t>
         </w:r>
@@ -5320,7 +5310,7 @@
         </w:rPr>
         <w:t xml:space="preserve">Tabla </w:t>
       </w:r>
-      <w:fldSimple w:dirty="true" w:instr=" SEQ Tabla \* ARABIC ">
+      <w:fldSimple w:instr=" SEQ Tabla \* ARABIC ">
         <w:r>
           <w:t xml:space="preserve">1</w:t>
         </w:r>
@@ -6103,7 +6093,7 @@
         </w:rPr>
         <w:t xml:space="preserve">Tabla </w:t>
       </w:r>
-      <w:fldSimple w:dirty="true" w:instr=" SEQ Tabla \* ARABIC ">
+      <w:fldSimple w:instr=" SEQ Tabla \* ARABIC ">
         <w:r>
           <w:t xml:space="preserve">1</w:t>
         </w:r>
@@ -10106,7 +10096,7 @@
         </w:rPr>
         <w:t xml:space="preserve">Tabla </w:t>
       </w:r>
-      <w:fldSimple w:dirty="true" w:instr=" SEQ Tabla \* ARABIC ">
+      <w:fldSimple w:instr=" SEQ Tabla \* ARABIC ">
         <w:r>
           <w:t xml:space="preserve">1</w:t>
         </w:r>
@@ -11440,7 +11430,7 @@
         </w:rPr>
         <w:t xml:space="preserve">Tabla </w:t>
       </w:r>
-      <w:fldSimple w:dirty="true" w:instr=" SEQ Tabla \* ARABIC ">
+      <w:fldSimple w:instr=" SEQ Tabla \* ARABIC ">
         <w:r>
           <w:t xml:space="preserve">1</w:t>
         </w:r>
@@ -12945,7 +12935,7 @@
         </w:rPr>
         <w:t xml:space="preserve">Tabla </w:t>
       </w:r>
-      <w:fldSimple w:dirty="true" w:instr=" SEQ Tabla \* ARABIC ">
+      <w:fldSimple w:instr=" SEQ Tabla \* ARABIC ">
         <w:r>
           <w:t xml:space="preserve">1</w:t>
         </w:r>
@@ -20646,7 +20636,7 @@
       </w:rPr>
       <w:tab/>
     </w:r>
-    <w:fldSimple w:dirty="true" w:instr=" PAGE ">
+    <w:fldSimple w:instr=" PAGE ">
       <w:r>
         <w:t xml:space="preserve">1</w:t>
       </w:r>

</xml_diff>